<commit_message>
Refine names and types of stakeholders
</commit_message>
<xml_diff>
--- a/IELTSFLOW/Stakeholder_Analysis.docx
+++ b/IELTSFLOW/Stakeholder_Analysis.docx
@@ -1047,10 +1047,7 @@
       </w:r>
       <w:proofErr w:type="spellEnd"/>
       <w:r>
-        <w:t>:</w:t>
-      </w:r>
-      <w:r>
-        <w:t xml:space="preserve"> </w:t>
+        <w:t xml:space="preserve">: </w:t>
       </w:r>
       <w:r>
         <w:rPr>
@@ -1347,10 +1344,7 @@
       </w:r>
       <w:proofErr w:type="spellEnd"/>
       <w:r>
-        <w:t>:</w:t>
-      </w:r>
-      <w:r>
-        <w:t xml:space="preserve"> </w:t>
+        <w:t xml:space="preserve">: </w:t>
       </w:r>
       <w:r>
         <w:rPr>
@@ -1666,10 +1660,7 @@
       </w:r>
       <w:proofErr w:type="spellEnd"/>
       <w:r>
-        <w:t>:</w:t>
-      </w:r>
-      <w:r>
-        <w:t xml:space="preserve"> </w:t>
+        <w:t xml:space="preserve">: </w:t>
       </w:r>
       <w:r>
         <w:rPr>
@@ -1927,10 +1918,7 @@
       </w:r>
       <w:proofErr w:type="spellEnd"/>
       <w:r>
-        <w:t>:</w:t>
-      </w:r>
-      <w:r>
-        <w:t xml:space="preserve"> </w:t>
+        <w:t xml:space="preserve">: </w:t>
       </w:r>
       <w:r>
         <w:rPr>
@@ -2155,10 +2143,7 @@
       </w:r>
       <w:proofErr w:type="spellEnd"/>
       <w:r>
-        <w:t>:</w:t>
-      </w:r>
-      <w:r>
-        <w:t xml:space="preserve"> </w:t>
+        <w:t xml:space="preserve">: </w:t>
       </w:r>
       <w:r>
         <w:rPr>
@@ -2320,16 +2305,16 @@
         <w:tblLook w:val="04A0" w:firstRow="1" w:lastRow="0" w:firstColumn="1" w:lastColumn="0" w:noHBand="0" w:noVBand="1"/>
       </w:tblPr>
       <w:tblGrid>
-        <w:gridCol w:w="2056"/>
-        <w:gridCol w:w="1589"/>
-        <w:gridCol w:w="1811"/>
-        <w:gridCol w:w="1983"/>
-        <w:gridCol w:w="1911"/>
+        <w:gridCol w:w="1993"/>
+        <w:gridCol w:w="1943"/>
+        <w:gridCol w:w="1696"/>
+        <w:gridCol w:w="1903"/>
+        <w:gridCol w:w="1815"/>
       </w:tblGrid>
       <w:tr>
         <w:tc>
           <w:tcPr>
-            <w:tcW w:w="2056" w:type="dxa"/>
+            <w:tcW w:w="1993" w:type="dxa"/>
           </w:tcPr>
           <w:p>
             <w:pPr>
@@ -2365,7 +2350,7 @@
         </w:tc>
         <w:tc>
           <w:tcPr>
-            <w:tcW w:w="1589" w:type="dxa"/>
+            <w:tcW w:w="1943" w:type="dxa"/>
           </w:tcPr>
           <w:p>
             <w:pPr>
@@ -2385,7 +2370,7 @@
         </w:tc>
         <w:tc>
           <w:tcPr>
-            <w:tcW w:w="1811" w:type="dxa"/>
+            <w:tcW w:w="1696" w:type="dxa"/>
           </w:tcPr>
           <w:p>
             <w:pPr>
@@ -2421,7 +2406,7 @@
         </w:tc>
         <w:tc>
           <w:tcPr>
-            <w:tcW w:w="1983" w:type="dxa"/>
+            <w:tcW w:w="1903" w:type="dxa"/>
           </w:tcPr>
           <w:p>
             <w:proofErr w:type="spellStart"/>
@@ -2508,7 +2493,7 @@
         </w:tc>
         <w:tc>
           <w:tcPr>
-            <w:tcW w:w="1911" w:type="dxa"/>
+            <w:tcW w:w="1815" w:type="dxa"/>
           </w:tcPr>
           <w:p>
             <w:proofErr w:type="spellStart"/>
@@ -2581,151 +2566,550 @@
       <w:tr>
         <w:tc>
           <w:tcPr>
-            <w:tcW w:w="2056" w:type="dxa"/>
-          </w:tcPr>
-          <w:p/>
-        </w:tc>
-        <w:tc>
-          <w:tcPr>
-            <w:tcW w:w="1589" w:type="dxa"/>
+            <w:tcW w:w="1993" w:type="dxa"/>
+            <w:tcBorders>
+              <w:bottom w:val="single" w:sz="4" w:space="0" w:color="auto"/>
+            </w:tcBorders>
           </w:tcPr>
           <w:p>
-            <w:pPr>
-              <w:rPr>
-                <w:b/>
-                <w:bCs/>
-              </w:rPr>
-            </w:pPr>
+            <w:proofErr w:type="spellStart"/>
+            <w:r>
+              <w:t>Quyết</w:t>
+            </w:r>
+            <w:proofErr w:type="spellEnd"/>
+            <w:r>
+              <w:t xml:space="preserve"> </w:t>
+            </w:r>
+            <w:proofErr w:type="spellStart"/>
+            <w:r>
+              <w:t>định</w:t>
+            </w:r>
+            <w:proofErr w:type="spellEnd"/>
+            <w:r>
+              <w:t xml:space="preserve"> </w:t>
+            </w:r>
+            <w:proofErr w:type="spellStart"/>
+            <w:r>
+              <w:t>và</w:t>
+            </w:r>
+            <w:proofErr w:type="spellEnd"/>
+            <w:r>
+              <w:t xml:space="preserve"> </w:t>
+            </w:r>
+            <w:proofErr w:type="spellStart"/>
+            <w:r>
+              <w:t>tài</w:t>
+            </w:r>
+            <w:proofErr w:type="spellEnd"/>
+            <w:r>
+              <w:t xml:space="preserve"> </w:t>
+            </w:r>
+            <w:proofErr w:type="spellStart"/>
+            <w:r>
+              <w:t>tr</w:t>
+            </w:r>
+            <w:r>
+              <w:t>ợ</w:t>
+            </w:r>
+            <w:proofErr w:type="spellEnd"/>
           </w:p>
         </w:tc>
         <w:tc>
           <w:tcPr>
-            <w:tcW w:w="1811" w:type="dxa"/>
+            <w:tcW w:w="1943" w:type="dxa"/>
           </w:tcPr>
           <w:p>
-            <w:pPr>
-              <w:rPr>
-                <w:b/>
-                <w:bCs/>
-              </w:rPr>
-            </w:pPr>
+            <w:r>
+              <w:t xml:space="preserve">Project </w:t>
+            </w:r>
+            <w:r>
+              <w:t>Spon</w:t>
+            </w:r>
+            <w:r>
+              <w:t>so</w:t>
+            </w:r>
+            <w:r>
+              <w:t xml:space="preserve">r </w:t>
+            </w:r>
           </w:p>
         </w:tc>
         <w:tc>
           <w:tcPr>
-            <w:tcW w:w="1983" w:type="dxa"/>
+            <w:tcW w:w="1696" w:type="dxa"/>
           </w:tcPr>
           <w:p>
-            <w:pPr>
-              <w:rPr>
-                <w:b/>
-                <w:bCs/>
-              </w:rPr>
-            </w:pPr>
+            <w:proofErr w:type="spellStart"/>
+            <w:r>
+              <w:t>Người</w:t>
+            </w:r>
+            <w:proofErr w:type="spellEnd"/>
+            <w:r>
+              <w:t xml:space="preserve"> </w:t>
+            </w:r>
+            <w:proofErr w:type="spellStart"/>
+            <w:r>
+              <w:t>quyết</w:t>
+            </w:r>
+            <w:proofErr w:type="spellEnd"/>
+            <w:r>
+              <w:t xml:space="preserve"> </w:t>
+            </w:r>
+            <w:proofErr w:type="spellStart"/>
+            <w:r>
+              <w:t>định</w:t>
+            </w:r>
+            <w:proofErr w:type="spellEnd"/>
+            <w:r>
+              <w:t xml:space="preserve"> </w:t>
+            </w:r>
+            <w:proofErr w:type="spellStart"/>
+            <w:r>
+              <w:t>duyệt</w:t>
+            </w:r>
+            <w:proofErr w:type="spellEnd"/>
+            <w:r>
+              <w:t xml:space="preserve"> </w:t>
+            </w:r>
+            <w:proofErr w:type="spellStart"/>
+            <w:r>
+              <w:t>đề</w:t>
+            </w:r>
+            <w:proofErr w:type="spellEnd"/>
+            <w:r>
+              <w:t xml:space="preserve"> </w:t>
+            </w:r>
+            <w:proofErr w:type="spellStart"/>
+            <w:r>
+              <w:t>tài</w:t>
+            </w:r>
+            <w:proofErr w:type="spellEnd"/>
+            <w:r>
+              <w:t xml:space="preserve">, </w:t>
+            </w:r>
+            <w:proofErr w:type="spellStart"/>
+            <w:r>
+              <w:t>đánh</w:t>
+            </w:r>
+            <w:proofErr w:type="spellEnd"/>
+            <w:r>
+              <w:t xml:space="preserve"> </w:t>
+            </w:r>
+            <w:proofErr w:type="spellStart"/>
+            <w:r>
+              <w:t>giá</w:t>
+            </w:r>
+            <w:proofErr w:type="spellEnd"/>
+            <w:r>
+              <w:t xml:space="preserve"> </w:t>
+            </w:r>
+            <w:proofErr w:type="spellStart"/>
+            <w:r>
+              <w:t>tiến</w:t>
+            </w:r>
+            <w:proofErr w:type="spellEnd"/>
+            <w:r>
+              <w:t xml:space="preserve"> </w:t>
+            </w:r>
+            <w:proofErr w:type="spellStart"/>
+            <w:r>
+              <w:t>độ</w:t>
+            </w:r>
+            <w:proofErr w:type="spellEnd"/>
+            <w:r>
+              <w:t xml:space="preserve">, </w:t>
+            </w:r>
+            <w:proofErr w:type="spellStart"/>
+            <w:r>
+              <w:t>nghiệm</w:t>
+            </w:r>
+            <w:proofErr w:type="spellEnd"/>
+            <w:r>
+              <w:t xml:space="preserve"> </w:t>
+            </w:r>
+            <w:proofErr w:type="spellStart"/>
+            <w:r>
+              <w:t>thu</w:t>
+            </w:r>
+            <w:proofErr w:type="spellEnd"/>
+            <w:r>
+              <w:t xml:space="preserve"> </w:t>
+            </w:r>
+            <w:proofErr w:type="spellStart"/>
+            <w:r>
+              <w:t>dự</w:t>
+            </w:r>
+            <w:proofErr w:type="spellEnd"/>
+            <w:r>
+              <w:t xml:space="preserve"> </w:t>
+            </w:r>
+            <w:proofErr w:type="spellStart"/>
+            <w:r>
+              <w:t>án</w:t>
+            </w:r>
+            <w:proofErr w:type="spellEnd"/>
           </w:p>
         </w:tc>
         <w:tc>
           <w:tcPr>
-            <w:tcW w:w="1911" w:type="dxa"/>
+            <w:tcW w:w="1903" w:type="dxa"/>
           </w:tcPr>
           <w:p>
-            <w:pPr>
-              <w:rPr>
-                <w:b/>
-                <w:bCs/>
-              </w:rPr>
-            </w:pPr>
+            <w:proofErr w:type="spellStart"/>
+            <w:r>
+              <w:t>Khả</w:t>
+            </w:r>
+            <w:proofErr w:type="spellEnd"/>
+            <w:r>
+              <w:t xml:space="preserve"> </w:t>
+            </w:r>
+            <w:proofErr w:type="spellStart"/>
+            <w:r>
+              <w:t>năng</w:t>
+            </w:r>
+            <w:proofErr w:type="spellEnd"/>
+            <w:r>
+              <w:t xml:space="preserve"> </w:t>
+            </w:r>
+            <w:proofErr w:type="spellStart"/>
+            <w:r>
+              <w:t>ứng</w:t>
+            </w:r>
+            <w:proofErr w:type="spellEnd"/>
+            <w:r>
+              <w:t xml:space="preserve"> </w:t>
+            </w:r>
+            <w:proofErr w:type="spellStart"/>
+            <w:r>
+              <w:t>dụng</w:t>
+            </w:r>
+            <w:proofErr w:type="spellEnd"/>
+            <w:r>
+              <w:t xml:space="preserve"> </w:t>
+            </w:r>
+            <w:proofErr w:type="spellStart"/>
+            <w:r>
+              <w:t>và</w:t>
+            </w:r>
+            <w:proofErr w:type="spellEnd"/>
+            <w:r>
+              <w:t xml:space="preserve"> </w:t>
+            </w:r>
+            <w:proofErr w:type="spellStart"/>
+            <w:r>
+              <w:t>mang</w:t>
+            </w:r>
+            <w:proofErr w:type="spellEnd"/>
+            <w:r>
+              <w:t xml:space="preserve"> </w:t>
+            </w:r>
+            <w:proofErr w:type="spellStart"/>
+            <w:r>
+              <w:t>lại</w:t>
+            </w:r>
+            <w:proofErr w:type="spellEnd"/>
+            <w:r>
+              <w:t xml:space="preserve"> </w:t>
+            </w:r>
+            <w:proofErr w:type="spellStart"/>
+            <w:r>
+              <w:t>giá</w:t>
+            </w:r>
+            <w:proofErr w:type="spellEnd"/>
+            <w:r>
+              <w:t xml:space="preserve"> </w:t>
+            </w:r>
+            <w:proofErr w:type="spellStart"/>
+            <w:r>
+              <w:t>trị</w:t>
+            </w:r>
+            <w:proofErr w:type="spellEnd"/>
+            <w:r>
+              <w:t xml:space="preserve"> </w:t>
+            </w:r>
+            <w:proofErr w:type="spellStart"/>
+            <w:r>
+              <w:t>thực</w:t>
+            </w:r>
+            <w:proofErr w:type="spellEnd"/>
+            <w:r>
+              <w:t xml:space="preserve"> </w:t>
+            </w:r>
+            <w:proofErr w:type="spellStart"/>
+            <w:r>
+              <w:t>tiễn</w:t>
+            </w:r>
+            <w:proofErr w:type="spellEnd"/>
+            <w:r>
+              <w:t xml:space="preserve">. </w:t>
+            </w:r>
+            <w:proofErr w:type="spellStart"/>
+            <w:r>
+              <w:t>Dự</w:t>
+            </w:r>
+            <w:proofErr w:type="spellEnd"/>
+            <w:r>
+              <w:t xml:space="preserve"> </w:t>
+            </w:r>
+            <w:proofErr w:type="spellStart"/>
+            <w:r>
+              <w:t>án</w:t>
+            </w:r>
+            <w:proofErr w:type="spellEnd"/>
+            <w:r>
+              <w:t xml:space="preserve"> </w:t>
+            </w:r>
+            <w:proofErr w:type="spellStart"/>
+            <w:r>
+              <w:t>hoàn</w:t>
+            </w:r>
+            <w:proofErr w:type="spellEnd"/>
+            <w:r>
+              <w:t xml:space="preserve"> </w:t>
+            </w:r>
+            <w:proofErr w:type="spellStart"/>
+            <w:r>
+              <w:t>thành</w:t>
+            </w:r>
+            <w:proofErr w:type="spellEnd"/>
+            <w:r>
+              <w:t xml:space="preserve"> </w:t>
+            </w:r>
+            <w:proofErr w:type="spellStart"/>
+            <w:r>
+              <w:t>đúng</w:t>
+            </w:r>
+            <w:proofErr w:type="spellEnd"/>
+            <w:r>
+              <w:t xml:space="preserve"> </w:t>
+            </w:r>
+            <w:proofErr w:type="spellStart"/>
+            <w:r>
+              <w:t>hạn</w:t>
+            </w:r>
+            <w:proofErr w:type="spellEnd"/>
+            <w:r>
+              <w:t xml:space="preserve">. </w:t>
+            </w:r>
+            <w:proofErr w:type="spellStart"/>
+            <w:r>
+              <w:t>Dự</w:t>
+            </w:r>
+            <w:proofErr w:type="spellEnd"/>
+            <w:r>
+              <w:t xml:space="preserve"> </w:t>
+            </w:r>
+            <w:proofErr w:type="spellStart"/>
+            <w:r>
+              <w:t>án</w:t>
+            </w:r>
+            <w:proofErr w:type="spellEnd"/>
+            <w:r>
+              <w:t xml:space="preserve"> </w:t>
+            </w:r>
+            <w:proofErr w:type="spellStart"/>
+            <w:r>
+              <w:t>hoàn</w:t>
+            </w:r>
+            <w:proofErr w:type="spellEnd"/>
+            <w:r>
+              <w:t xml:space="preserve"> </w:t>
+            </w:r>
+            <w:proofErr w:type="spellStart"/>
+            <w:r>
+              <w:t>thành</w:t>
+            </w:r>
+            <w:proofErr w:type="spellEnd"/>
+            <w:r>
+              <w:t xml:space="preserve"> </w:t>
+            </w:r>
+            <w:proofErr w:type="spellStart"/>
+            <w:r>
+              <w:t>những</w:t>
+            </w:r>
+            <w:proofErr w:type="spellEnd"/>
+            <w:r>
+              <w:t xml:space="preserve"> </w:t>
+            </w:r>
+            <w:proofErr w:type="spellStart"/>
+            <w:r>
+              <w:t>yêu</w:t>
+            </w:r>
+            <w:proofErr w:type="spellEnd"/>
+            <w:r>
+              <w:t xml:space="preserve"> </w:t>
+            </w:r>
+            <w:proofErr w:type="spellStart"/>
+            <w:r>
+              <w:t>cầu</w:t>
+            </w:r>
+            <w:proofErr w:type="spellEnd"/>
+            <w:r>
+              <w:t xml:space="preserve"> </w:t>
+            </w:r>
+            <w:proofErr w:type="spellStart"/>
+            <w:r>
+              <w:t>đề</w:t>
+            </w:r>
+            <w:proofErr w:type="spellEnd"/>
+            <w:r>
+              <w:t xml:space="preserve"> </w:t>
+            </w:r>
+            <w:proofErr w:type="spellStart"/>
+            <w:r>
+              <w:t>ra</w:t>
+            </w:r>
+            <w:proofErr w:type="spellEnd"/>
+            <w:r>
+              <w:t xml:space="preserve"> </w:t>
+            </w:r>
+            <w:proofErr w:type="spellStart"/>
+            <w:r>
+              <w:t>với</w:t>
+            </w:r>
+            <w:proofErr w:type="spellEnd"/>
+            <w:r>
+              <w:t xml:space="preserve"> </w:t>
+            </w:r>
+            <w:proofErr w:type="spellStart"/>
+            <w:r>
+              <w:t>độ</w:t>
+            </w:r>
+            <w:proofErr w:type="spellEnd"/>
+            <w:r>
+              <w:t xml:space="preserve"> </w:t>
+            </w:r>
+            <w:proofErr w:type="spellStart"/>
+            <w:r>
+              <w:t>hoàn</w:t>
+            </w:r>
+            <w:proofErr w:type="spellEnd"/>
+            <w:r>
+              <w:t xml:space="preserve"> </w:t>
+            </w:r>
+            <w:proofErr w:type="spellStart"/>
+            <w:r>
+              <w:t>thiện</w:t>
+            </w:r>
+            <w:proofErr w:type="spellEnd"/>
+            <w:r>
+              <w:t xml:space="preserve"> </w:t>
+            </w:r>
+            <w:proofErr w:type="spellStart"/>
+            <w:r>
+              <w:t>cao</w:t>
+            </w:r>
+            <w:proofErr w:type="spellEnd"/>
+            <w:r>
+              <w:t>.</w:t>
+            </w:r>
+          </w:p>
+        </w:tc>
+        <w:tc>
+          <w:tcPr>
+            <w:tcW w:w="1815" w:type="dxa"/>
+          </w:tcPr>
+          <w:p>
+            <w:r>
+              <w:t>Cao</w:t>
+            </w:r>
           </w:p>
         </w:tc>
       </w:tr>
       <w:tr>
         <w:tc>
           <w:tcPr>
-            <w:tcW w:w="2056" w:type="dxa"/>
+            <w:tcW w:w="1993" w:type="dxa"/>
+            <w:tcBorders>
+              <w:bottom w:val="nil"/>
+            </w:tcBorders>
+          </w:tcPr>
+          <w:p>
+            <w:r>
+              <w:t xml:space="preserve">Chuyên gia </w:t>
+            </w:r>
+            <w:proofErr w:type="spellStart"/>
+            <w:r>
+              <w:t>nghiệp</w:t>
+            </w:r>
+            <w:proofErr w:type="spellEnd"/>
+            <w:r>
+              <w:t xml:space="preserve"> </w:t>
+            </w:r>
+            <w:proofErr w:type="spellStart"/>
+            <w:r>
+              <w:t>vụ</w:t>
+            </w:r>
+            <w:proofErr w:type="spellEnd"/>
+          </w:p>
+        </w:tc>
+        <w:tc>
+          <w:tcPr>
+            <w:tcW w:w="1943" w:type="dxa"/>
+          </w:tcPr>
+          <w:p>
+            <w:r>
+              <w:t>Mentor (domain SMEs)</w:t>
+            </w:r>
+          </w:p>
+        </w:tc>
+        <w:tc>
+          <w:tcPr>
+            <w:tcW w:w="1696" w:type="dxa"/>
           </w:tcPr>
           <w:p/>
         </w:tc>
         <w:tc>
           <w:tcPr>
-            <w:tcW w:w="1589" w:type="dxa"/>
-          </w:tcPr>
-          <w:p>
-            <w:pPr>
-              <w:rPr>
-                <w:b/>
-                <w:bCs/>
-              </w:rPr>
-            </w:pPr>
-          </w:p>
-        </w:tc>
-        <w:tc>
-          <w:tcPr>
-            <w:tcW w:w="1811" w:type="dxa"/>
-          </w:tcPr>
-          <w:p>
-            <w:pPr>
-              <w:rPr>
-                <w:b/>
-                <w:bCs/>
-              </w:rPr>
-            </w:pPr>
-          </w:p>
-        </w:tc>
-        <w:tc>
-          <w:tcPr>
-            <w:tcW w:w="1983" w:type="dxa"/>
-          </w:tcPr>
-          <w:p>
-            <w:pPr>
-              <w:rPr>
-                <w:b/>
-                <w:bCs/>
-              </w:rPr>
-            </w:pPr>
-          </w:p>
-        </w:tc>
-        <w:tc>
-          <w:tcPr>
-            <w:tcW w:w="1911" w:type="dxa"/>
-          </w:tcPr>
-          <w:p>
-            <w:pPr>
-              <w:rPr>
-                <w:b/>
-                <w:bCs/>
-              </w:rPr>
-            </w:pPr>
-          </w:p>
+            <w:tcW w:w="1903" w:type="dxa"/>
+          </w:tcPr>
+          <w:p/>
+        </w:tc>
+        <w:tc>
+          <w:tcPr>
+            <w:tcW w:w="1815" w:type="dxa"/>
+          </w:tcPr>
+          <w:p/>
         </w:tc>
       </w:tr>
       <w:tr>
         <w:tc>
           <w:tcPr>
-            <w:tcW w:w="2056" w:type="dxa"/>
+            <w:tcW w:w="1993" w:type="dxa"/>
+            <w:tcBorders>
+              <w:top w:val="nil"/>
+              <w:bottom w:val="single" w:sz="4" w:space="0" w:color="auto"/>
+            </w:tcBorders>
           </w:tcPr>
           <w:p/>
         </w:tc>
         <w:tc>
           <w:tcPr>
-            <w:tcW w:w="1589" w:type="dxa"/>
+            <w:tcW w:w="1943" w:type="dxa"/>
+          </w:tcPr>
+          <w:p>
+            <w:r>
+              <w:t>Admin</w:t>
+            </w:r>
+            <w:r>
+              <w:t xml:space="preserve"> (Implementation SMEs)</w:t>
+            </w:r>
+          </w:p>
+        </w:tc>
+        <w:tc>
+          <w:tcPr>
+            <w:tcW w:w="1696" w:type="dxa"/>
           </w:tcPr>
           <w:p/>
         </w:tc>
         <w:tc>
           <w:tcPr>
-            <w:tcW w:w="1811" w:type="dxa"/>
+            <w:tcW w:w="1903" w:type="dxa"/>
           </w:tcPr>
           <w:p/>
         </w:tc>
         <w:tc>
           <w:tcPr>
-            <w:tcW w:w="1983" w:type="dxa"/>
-          </w:tcPr>
-          <w:p/>
-        </w:tc>
-        <w:tc>
-          <w:tcPr>
-            <w:tcW w:w="1911" w:type="dxa"/>
+            <w:tcW w:w="1815" w:type="dxa"/>
           </w:tcPr>
           <w:p/>
         </w:tc>
@@ -2733,31 +3117,60 @@
       <w:tr>
         <w:tc>
           <w:tcPr>
-            <w:tcW w:w="2056" w:type="dxa"/>
+            <w:tcW w:w="1993" w:type="dxa"/>
+            <w:tcBorders>
+              <w:bottom w:val="nil"/>
+            </w:tcBorders>
+          </w:tcPr>
+          <w:p>
+            <w:proofErr w:type="spellStart"/>
+            <w:r>
+              <w:t>Người</w:t>
+            </w:r>
+            <w:proofErr w:type="spellEnd"/>
+            <w:r>
+              <w:t xml:space="preserve"> </w:t>
+            </w:r>
+            <w:proofErr w:type="spellStart"/>
+            <w:r>
+              <w:t>dùng</w:t>
+            </w:r>
+            <w:proofErr w:type="spellEnd"/>
+            <w:r>
+              <w:t xml:space="preserve"> </w:t>
+            </w:r>
+            <w:proofErr w:type="spellStart"/>
+            <w:r>
+              <w:t>cuối</w:t>
+            </w:r>
+            <w:proofErr w:type="spellEnd"/>
+          </w:p>
+        </w:tc>
+        <w:tc>
+          <w:tcPr>
+            <w:tcW w:w="1943" w:type="dxa"/>
+          </w:tcPr>
+          <w:p>
+            <w:r>
+              <w:t>Guest</w:t>
+            </w:r>
+          </w:p>
+        </w:tc>
+        <w:tc>
+          <w:tcPr>
+            <w:tcW w:w="1696" w:type="dxa"/>
           </w:tcPr>
           <w:p/>
         </w:tc>
         <w:tc>
           <w:tcPr>
-            <w:tcW w:w="1589" w:type="dxa"/>
+            <w:tcW w:w="1903" w:type="dxa"/>
           </w:tcPr>
           <w:p/>
         </w:tc>
         <w:tc>
           <w:tcPr>
-            <w:tcW w:w="1811" w:type="dxa"/>
-          </w:tcPr>
-          <w:p/>
-        </w:tc>
-        <w:tc>
-          <w:tcPr>
-            <w:tcW w:w="1983" w:type="dxa"/>
-          </w:tcPr>
-          <w:p/>
-        </w:tc>
-        <w:tc>
-          <w:tcPr>
-            <w:tcW w:w="1911" w:type="dxa"/>
+            <w:tcW w:w="1815" w:type="dxa"/>
           </w:tcPr>
           <w:p/>
         </w:tc>
@@ -2765,31 +3178,39 @@
       <w:tr>
         <w:tc>
           <w:tcPr>
-            <w:tcW w:w="2056" w:type="dxa"/>
+            <w:tcW w:w="1993" w:type="dxa"/>
+            <w:tcBorders>
+              <w:top w:val="nil"/>
+              <w:bottom w:val="nil"/>
+            </w:tcBorders>
           </w:tcPr>
           <w:p/>
         </w:tc>
         <w:tc>
           <w:tcPr>
-            <w:tcW w:w="1589" w:type="dxa"/>
+            <w:tcW w:w="1943" w:type="dxa"/>
+          </w:tcPr>
+          <w:p>
+            <w:r>
+              <w:t>Candidate</w:t>
+            </w:r>
+          </w:p>
+        </w:tc>
+        <w:tc>
+          <w:tcPr>
+            <w:tcW w:w="1696" w:type="dxa"/>
           </w:tcPr>
           <w:p/>
         </w:tc>
         <w:tc>
           <w:tcPr>
-            <w:tcW w:w="1811" w:type="dxa"/>
+            <w:tcW w:w="1903" w:type="dxa"/>
           </w:tcPr>
           <w:p/>
         </w:tc>
         <w:tc>
           <w:tcPr>
-            <w:tcW w:w="1983" w:type="dxa"/>
-          </w:tcPr>
-          <w:p/>
-        </w:tc>
-        <w:tc>
-          <w:tcPr>
-            <w:tcW w:w="1911" w:type="dxa"/>
+            <w:tcW w:w="1815" w:type="dxa"/>
           </w:tcPr>
           <w:p/>
         </w:tc>
@@ -2797,31 +3218,39 @@
       <w:tr>
         <w:tc>
           <w:tcPr>
-            <w:tcW w:w="2056" w:type="dxa"/>
+            <w:tcW w:w="1993" w:type="dxa"/>
+            <w:tcBorders>
+              <w:top w:val="nil"/>
+              <w:bottom w:val="nil"/>
+            </w:tcBorders>
           </w:tcPr>
           <w:p/>
         </w:tc>
         <w:tc>
           <w:tcPr>
-            <w:tcW w:w="1589" w:type="dxa"/>
+            <w:tcW w:w="1943" w:type="dxa"/>
+          </w:tcPr>
+          <w:p>
+            <w:r>
+              <w:t>Mentor</w:t>
+            </w:r>
+          </w:p>
+        </w:tc>
+        <w:tc>
+          <w:tcPr>
+            <w:tcW w:w="1696" w:type="dxa"/>
           </w:tcPr>
           <w:p/>
         </w:tc>
         <w:tc>
           <w:tcPr>
-            <w:tcW w:w="1811" w:type="dxa"/>
+            <w:tcW w:w="1903" w:type="dxa"/>
           </w:tcPr>
           <w:p/>
         </w:tc>
         <w:tc>
           <w:tcPr>
-            <w:tcW w:w="1983" w:type="dxa"/>
-          </w:tcPr>
-          <w:p/>
-        </w:tc>
-        <w:tc>
-          <w:tcPr>
-            <w:tcW w:w="1911" w:type="dxa"/>
+            <w:tcW w:w="1815" w:type="dxa"/>
           </w:tcPr>
           <w:p/>
         </w:tc>
@@ -2829,31 +3258,39 @@
       <w:tr>
         <w:tc>
           <w:tcPr>
-            <w:tcW w:w="2056" w:type="dxa"/>
+            <w:tcW w:w="1993" w:type="dxa"/>
+            <w:tcBorders>
+              <w:top w:val="nil"/>
+              <w:bottom w:val="single" w:sz="4" w:space="0" w:color="auto"/>
+            </w:tcBorders>
           </w:tcPr>
           <w:p/>
         </w:tc>
         <w:tc>
           <w:tcPr>
-            <w:tcW w:w="1589" w:type="dxa"/>
+            <w:tcW w:w="1943" w:type="dxa"/>
+          </w:tcPr>
+          <w:p>
+            <w:r>
+              <w:t>Admin</w:t>
+            </w:r>
+          </w:p>
+        </w:tc>
+        <w:tc>
+          <w:tcPr>
+            <w:tcW w:w="1696" w:type="dxa"/>
           </w:tcPr>
           <w:p/>
         </w:tc>
         <w:tc>
           <w:tcPr>
-            <w:tcW w:w="1811" w:type="dxa"/>
+            <w:tcW w:w="1903" w:type="dxa"/>
           </w:tcPr>
           <w:p/>
         </w:tc>
         <w:tc>
           <w:tcPr>
-            <w:tcW w:w="1983" w:type="dxa"/>
-          </w:tcPr>
-          <w:p/>
-        </w:tc>
-        <w:tc>
-          <w:tcPr>
-            <w:tcW w:w="1911" w:type="dxa"/>
+            <w:tcW w:w="1815" w:type="dxa"/>
           </w:tcPr>
           <w:p/>
         </w:tc>
@@ -2861,31 +3298,465 @@
       <w:tr>
         <w:tc>
           <w:tcPr>
-            <w:tcW w:w="2056" w:type="dxa"/>
+            <w:tcW w:w="1993" w:type="dxa"/>
+            <w:tcBorders>
+              <w:bottom w:val="nil"/>
+            </w:tcBorders>
+          </w:tcPr>
+          <w:p>
+            <w:proofErr w:type="spellStart"/>
+            <w:r>
+              <w:t>Thực</w:t>
+            </w:r>
+            <w:proofErr w:type="spellEnd"/>
+            <w:r>
+              <w:t xml:space="preserve"> </w:t>
+            </w:r>
+            <w:proofErr w:type="spellStart"/>
+            <w:r>
+              <w:t>thi</w:t>
+            </w:r>
+            <w:proofErr w:type="spellEnd"/>
+            <w:r>
+              <w:t xml:space="preserve"> </w:t>
+            </w:r>
+            <w:proofErr w:type="spellStart"/>
+            <w:r>
+              <w:t>và</w:t>
+            </w:r>
+            <w:proofErr w:type="spellEnd"/>
+            <w:r>
+              <w:t xml:space="preserve"> </w:t>
+            </w:r>
+            <w:proofErr w:type="spellStart"/>
+            <w:r>
+              <w:t>xây</w:t>
+            </w:r>
+            <w:proofErr w:type="spellEnd"/>
+            <w:r>
+              <w:t xml:space="preserve"> </w:t>
+            </w:r>
+            <w:proofErr w:type="spellStart"/>
+            <w:r>
+              <w:t>d</w:t>
+            </w:r>
+            <w:r>
+              <w:t>ựng</w:t>
+            </w:r>
+            <w:proofErr w:type="spellEnd"/>
+            <w:r>
+              <w:t xml:space="preserve"> </w:t>
+            </w:r>
+            <w:proofErr w:type="spellStart"/>
+            <w:r>
+              <w:t>dự</w:t>
+            </w:r>
+            <w:proofErr w:type="spellEnd"/>
+            <w:r>
+              <w:t xml:space="preserve"> </w:t>
+            </w:r>
+            <w:proofErr w:type="spellStart"/>
+            <w:r>
+              <w:t>án</w:t>
+            </w:r>
+            <w:proofErr w:type="spellEnd"/>
+          </w:p>
+        </w:tc>
+        <w:tc>
+          <w:tcPr>
+            <w:tcW w:w="1943" w:type="dxa"/>
+          </w:tcPr>
+          <w:p>
+            <w:r>
+              <w:t>Developer</w:t>
+            </w:r>
+          </w:p>
+        </w:tc>
+        <w:tc>
+          <w:tcPr>
+            <w:tcW w:w="1696" w:type="dxa"/>
           </w:tcPr>
           <w:p/>
         </w:tc>
         <w:tc>
           <w:tcPr>
-            <w:tcW w:w="1589" w:type="dxa"/>
+            <w:tcW w:w="1903" w:type="dxa"/>
           </w:tcPr>
           <w:p/>
         </w:tc>
         <w:tc>
           <w:tcPr>
-            <w:tcW w:w="1811" w:type="dxa"/>
+            <w:tcW w:w="1815" w:type="dxa"/>
           </w:tcPr>
           <w:p/>
         </w:tc>
-        <w:tc>
-          <w:tcPr>
-            <w:tcW w:w="1983" w:type="dxa"/>
+      </w:tr>
+      <w:tr>
+        <w:tc>
+          <w:tcPr>
+            <w:tcW w:w="1993" w:type="dxa"/>
+            <w:tcBorders>
+              <w:top w:val="nil"/>
+              <w:bottom w:val="nil"/>
+            </w:tcBorders>
           </w:tcPr>
           <w:p/>
         </w:tc>
         <w:tc>
           <w:tcPr>
-            <w:tcW w:w="1911" w:type="dxa"/>
+            <w:tcW w:w="1943" w:type="dxa"/>
+          </w:tcPr>
+          <w:p>
+            <w:r>
+              <w:t>BA</w:t>
+            </w:r>
+          </w:p>
+        </w:tc>
+        <w:tc>
+          <w:tcPr>
+            <w:tcW w:w="1696" w:type="dxa"/>
+          </w:tcPr>
+          <w:p/>
+        </w:tc>
+        <w:tc>
+          <w:tcPr>
+            <w:tcW w:w="1903" w:type="dxa"/>
+          </w:tcPr>
+          <w:p/>
+        </w:tc>
+        <w:tc>
+          <w:tcPr>
+            <w:tcW w:w="1815" w:type="dxa"/>
+          </w:tcPr>
+          <w:p/>
+        </w:tc>
+      </w:tr>
+      <w:tr>
+        <w:tc>
+          <w:tcPr>
+            <w:tcW w:w="1993" w:type="dxa"/>
+            <w:tcBorders>
+              <w:top w:val="nil"/>
+              <w:bottom w:val="nil"/>
+            </w:tcBorders>
+          </w:tcPr>
+          <w:p/>
+        </w:tc>
+        <w:tc>
+          <w:tcPr>
+            <w:tcW w:w="1943" w:type="dxa"/>
+          </w:tcPr>
+          <w:p>
+            <w:r>
+              <w:t>T</w:t>
+            </w:r>
+            <w:r>
+              <w:t>ester</w:t>
+            </w:r>
+          </w:p>
+        </w:tc>
+        <w:tc>
+          <w:tcPr>
+            <w:tcW w:w="1696" w:type="dxa"/>
+          </w:tcPr>
+          <w:p/>
+        </w:tc>
+        <w:tc>
+          <w:tcPr>
+            <w:tcW w:w="1903" w:type="dxa"/>
+          </w:tcPr>
+          <w:p/>
+        </w:tc>
+        <w:tc>
+          <w:tcPr>
+            <w:tcW w:w="1815" w:type="dxa"/>
+          </w:tcPr>
+          <w:p/>
+        </w:tc>
+      </w:tr>
+      <w:tr>
+        <w:tc>
+          <w:tcPr>
+            <w:tcW w:w="1993" w:type="dxa"/>
+            <w:tcBorders>
+              <w:top w:val="nil"/>
+              <w:bottom w:val="single" w:sz="4" w:space="0" w:color="auto"/>
+            </w:tcBorders>
+          </w:tcPr>
+          <w:p/>
+        </w:tc>
+        <w:tc>
+          <w:tcPr>
+            <w:tcW w:w="1943" w:type="dxa"/>
+          </w:tcPr>
+          <w:p>
+            <w:r>
+              <w:t>PM</w:t>
+            </w:r>
+          </w:p>
+        </w:tc>
+        <w:tc>
+          <w:tcPr>
+            <w:tcW w:w="1696" w:type="dxa"/>
+          </w:tcPr>
+          <w:p/>
+        </w:tc>
+        <w:tc>
+          <w:tcPr>
+            <w:tcW w:w="1903" w:type="dxa"/>
+          </w:tcPr>
+          <w:p/>
+        </w:tc>
+        <w:tc>
+          <w:tcPr>
+            <w:tcW w:w="1815" w:type="dxa"/>
+          </w:tcPr>
+          <w:p/>
+        </w:tc>
+      </w:tr>
+      <w:tr>
+        <w:tc>
+          <w:tcPr>
+            <w:tcW w:w="1993" w:type="dxa"/>
+            <w:tcBorders>
+              <w:top w:val="single" w:sz="4" w:space="0" w:color="auto"/>
+              <w:bottom w:val="nil"/>
+            </w:tcBorders>
+          </w:tcPr>
+          <w:p>
+            <w:proofErr w:type="spellStart"/>
+            <w:r>
+              <w:t>Vận</w:t>
+            </w:r>
+            <w:proofErr w:type="spellEnd"/>
+            <w:r>
+              <w:t xml:space="preserve"> </w:t>
+            </w:r>
+            <w:proofErr w:type="spellStart"/>
+            <w:r>
+              <w:t>hành</w:t>
+            </w:r>
+            <w:proofErr w:type="spellEnd"/>
+            <w:r>
+              <w:t xml:space="preserve"> </w:t>
+            </w:r>
+            <w:proofErr w:type="spellStart"/>
+            <w:r>
+              <w:t>và</w:t>
+            </w:r>
+            <w:proofErr w:type="spellEnd"/>
+            <w:r>
+              <w:t xml:space="preserve"> </w:t>
+            </w:r>
+            <w:proofErr w:type="spellStart"/>
+            <w:r>
+              <w:t>bảo</w:t>
+            </w:r>
+            <w:proofErr w:type="spellEnd"/>
+            <w:r>
+              <w:t xml:space="preserve"> </w:t>
+            </w:r>
+            <w:proofErr w:type="spellStart"/>
+            <w:r>
+              <w:t>tr</w:t>
+            </w:r>
+            <w:r>
+              <w:t>ì</w:t>
+            </w:r>
+            <w:proofErr w:type="spellEnd"/>
+          </w:p>
+        </w:tc>
+        <w:tc>
+          <w:tcPr>
+            <w:tcW w:w="1943" w:type="dxa"/>
+          </w:tcPr>
+          <w:p>
+            <w:r>
+              <w:t>Admin</w:t>
+            </w:r>
+          </w:p>
+        </w:tc>
+        <w:tc>
+          <w:tcPr>
+            <w:tcW w:w="1696" w:type="dxa"/>
+          </w:tcPr>
+          <w:p/>
+        </w:tc>
+        <w:tc>
+          <w:tcPr>
+            <w:tcW w:w="1903" w:type="dxa"/>
+          </w:tcPr>
+          <w:p/>
+        </w:tc>
+        <w:tc>
+          <w:tcPr>
+            <w:tcW w:w="1815" w:type="dxa"/>
+          </w:tcPr>
+          <w:p/>
+        </w:tc>
+      </w:tr>
+      <w:tr>
+        <w:tc>
+          <w:tcPr>
+            <w:tcW w:w="1993" w:type="dxa"/>
+            <w:tcBorders>
+              <w:top w:val="nil"/>
+              <w:bottom w:val="single" w:sz="4" w:space="0" w:color="auto"/>
+            </w:tcBorders>
+          </w:tcPr>
+          <w:p/>
+        </w:tc>
+        <w:tc>
+          <w:tcPr>
+            <w:tcW w:w="1943" w:type="dxa"/>
+          </w:tcPr>
+          <w:p>
+            <w:r>
+              <w:t>IT Support</w:t>
+            </w:r>
+          </w:p>
+        </w:tc>
+        <w:tc>
+          <w:tcPr>
+            <w:tcW w:w="1696" w:type="dxa"/>
+          </w:tcPr>
+          <w:p/>
+        </w:tc>
+        <w:tc>
+          <w:tcPr>
+            <w:tcW w:w="1903" w:type="dxa"/>
+          </w:tcPr>
+          <w:p/>
+        </w:tc>
+        <w:tc>
+          <w:tcPr>
+            <w:tcW w:w="1815" w:type="dxa"/>
+          </w:tcPr>
+          <w:p/>
+        </w:tc>
+      </w:tr>
+      <w:tr>
+        <w:tc>
+          <w:tcPr>
+            <w:tcW w:w="1993" w:type="dxa"/>
+            <w:tcBorders>
+              <w:bottom w:val="nil"/>
+            </w:tcBorders>
+          </w:tcPr>
+          <w:p>
+            <w:proofErr w:type="spellStart"/>
+            <w:r>
+              <w:lastRenderedPageBreak/>
+              <w:t>Nhóm</w:t>
+            </w:r>
+            <w:proofErr w:type="spellEnd"/>
+            <w:r>
+              <w:t xml:space="preserve"> </w:t>
+            </w:r>
+            <w:proofErr w:type="spellStart"/>
+            <w:r>
+              <w:t>Bên</w:t>
+            </w:r>
+            <w:proofErr w:type="spellEnd"/>
+            <w:r>
+              <w:t xml:space="preserve"> </w:t>
+            </w:r>
+            <w:proofErr w:type="spellStart"/>
+            <w:r>
+              <w:t>ngoài</w:t>
+            </w:r>
+            <w:proofErr w:type="spellEnd"/>
+            <w:r>
+              <w:t xml:space="preserve"> /</w:t>
+            </w:r>
+            <w:r>
+              <w:t xml:space="preserve"> </w:t>
+            </w:r>
+            <w:proofErr w:type="spellStart"/>
+            <w:r>
+              <w:t>Đối</w:t>
+            </w:r>
+            <w:proofErr w:type="spellEnd"/>
+            <w:r>
+              <w:t xml:space="preserve"> tác</w:t>
+            </w:r>
+          </w:p>
+        </w:tc>
+        <w:tc>
+          <w:tcPr>
+            <w:tcW w:w="1943" w:type="dxa"/>
+          </w:tcPr>
+          <w:p>
+            <w:r>
+              <w:t>AI service</w:t>
+            </w:r>
+            <w:r>
+              <w:t>s</w:t>
+            </w:r>
+          </w:p>
+        </w:tc>
+        <w:tc>
+          <w:tcPr>
+            <w:tcW w:w="1696" w:type="dxa"/>
+          </w:tcPr>
+          <w:p/>
+        </w:tc>
+        <w:tc>
+          <w:tcPr>
+            <w:tcW w:w="1903" w:type="dxa"/>
+          </w:tcPr>
+          <w:p/>
+        </w:tc>
+        <w:tc>
+          <w:tcPr>
+            <w:tcW w:w="1815" w:type="dxa"/>
+          </w:tcPr>
+          <w:p/>
+        </w:tc>
+      </w:tr>
+      <w:tr>
+        <w:tc>
+          <w:tcPr>
+            <w:tcW w:w="1993" w:type="dxa"/>
+            <w:tcBorders>
+              <w:top w:val="nil"/>
+            </w:tcBorders>
+          </w:tcPr>
+          <w:p/>
+        </w:tc>
+        <w:tc>
+          <w:tcPr>
+            <w:tcW w:w="1943" w:type="dxa"/>
+          </w:tcPr>
+          <w:p>
+            <w:proofErr w:type="spellStart"/>
+            <w:r>
+              <w:t>S</w:t>
+            </w:r>
+            <w:r>
+              <w:t>e</w:t>
+            </w:r>
+            <w:r>
+              <w:t>pay</w:t>
+            </w:r>
+            <w:proofErr w:type="spellEnd"/>
+          </w:p>
+        </w:tc>
+        <w:tc>
+          <w:tcPr>
+            <w:tcW w:w="1696" w:type="dxa"/>
+          </w:tcPr>
+          <w:p/>
+        </w:tc>
+        <w:tc>
+          <w:tcPr>
+            <w:tcW w:w="1903" w:type="dxa"/>
+          </w:tcPr>
+          <w:p/>
+        </w:tc>
+        <w:tc>
+          <w:tcPr>
+            <w:tcW w:w="1815" w:type="dxa"/>
           </w:tcPr>
           <w:p/>
         </w:tc>
@@ -3248,6 +4119,119 @@
     </w:lvl>
   </w:abstractNum>
   <w:abstractNum w:abstractNumId="3" w15:restartNumberingAfterBreak="0">
+    <w:nsid w:val="0F223C07"/>
+    <w:multiLevelType w:val="hybridMultilevel"/>
+    <w:tmpl w:val="F7DC3986"/>
+    <w:lvl w:ilvl="0" w:tplc="04090001">
+      <w:start w:val="1"/>
+      <w:numFmt w:val="bullet"/>
+      <w:lvlText w:val=""/>
+      <w:lvlJc w:val="left"/>
+      <w:pPr>
+        <w:ind w:left="720" w:hanging="360"/>
+      </w:pPr>
+      <w:rPr>
+        <w:rFonts w:ascii="Symbol" w:hAnsi="Symbol" w:hint="default"/>
+      </w:rPr>
+    </w:lvl>
+    <w:lvl w:ilvl="1" w:tplc="04090003" w:tentative="1">
+      <w:start w:val="1"/>
+      <w:numFmt w:val="bullet"/>
+      <w:lvlText w:val="o"/>
+      <w:lvlJc w:val="left"/>
+      <w:pPr>
+        <w:ind w:left="1440" w:hanging="360"/>
+      </w:pPr>
+      <w:rPr>
+        <w:rFonts w:ascii="Courier New" w:hAnsi="Courier New" w:cs="Courier New" w:hint="default"/>
+      </w:rPr>
+    </w:lvl>
+    <w:lvl w:ilvl="2" w:tplc="04090005" w:tentative="1">
+      <w:start w:val="1"/>
+      <w:numFmt w:val="bullet"/>
+      <w:lvlText w:val=""/>
+      <w:lvlJc w:val="left"/>
+      <w:pPr>
+        <w:ind w:left="2160" w:hanging="360"/>
+      </w:pPr>
+      <w:rPr>
+        <w:rFonts w:ascii="Wingdings" w:hAnsi="Wingdings" w:hint="default"/>
+      </w:rPr>
+    </w:lvl>
+    <w:lvl w:ilvl="3" w:tplc="04090001" w:tentative="1">
+      <w:start w:val="1"/>
+      <w:numFmt w:val="bullet"/>
+      <w:lvlText w:val=""/>
+      <w:lvlJc w:val="left"/>
+      <w:pPr>
+        <w:ind w:left="2880" w:hanging="360"/>
+      </w:pPr>
+      <w:rPr>
+        <w:rFonts w:ascii="Symbol" w:hAnsi="Symbol" w:hint="default"/>
+      </w:rPr>
+    </w:lvl>
+    <w:lvl w:ilvl="4" w:tplc="04090003" w:tentative="1">
+      <w:start w:val="1"/>
+      <w:numFmt w:val="bullet"/>
+      <w:lvlText w:val="o"/>
+      <w:lvlJc w:val="left"/>
+      <w:pPr>
+        <w:ind w:left="3600" w:hanging="360"/>
+      </w:pPr>
+      <w:rPr>
+        <w:rFonts w:ascii="Courier New" w:hAnsi="Courier New" w:cs="Courier New" w:hint="default"/>
+      </w:rPr>
+    </w:lvl>
+    <w:lvl w:ilvl="5" w:tplc="04090005" w:tentative="1">
+      <w:start w:val="1"/>
+      <w:numFmt w:val="bullet"/>
+      <w:lvlText w:val=""/>
+      <w:lvlJc w:val="left"/>
+      <w:pPr>
+        <w:ind w:left="4320" w:hanging="360"/>
+      </w:pPr>
+      <w:rPr>
+        <w:rFonts w:ascii="Wingdings" w:hAnsi="Wingdings" w:hint="default"/>
+      </w:rPr>
+    </w:lvl>
+    <w:lvl w:ilvl="6" w:tplc="04090001" w:tentative="1">
+      <w:start w:val="1"/>
+      <w:numFmt w:val="bullet"/>
+      <w:lvlText w:val=""/>
+      <w:lvlJc w:val="left"/>
+      <w:pPr>
+        <w:ind w:left="5040" w:hanging="360"/>
+      </w:pPr>
+      <w:rPr>
+        <w:rFonts w:ascii="Symbol" w:hAnsi="Symbol" w:hint="default"/>
+      </w:rPr>
+    </w:lvl>
+    <w:lvl w:ilvl="7" w:tplc="04090003" w:tentative="1">
+      <w:start w:val="1"/>
+      <w:numFmt w:val="bullet"/>
+      <w:lvlText w:val="o"/>
+      <w:lvlJc w:val="left"/>
+      <w:pPr>
+        <w:ind w:left="5760" w:hanging="360"/>
+      </w:pPr>
+      <w:rPr>
+        <w:rFonts w:ascii="Courier New" w:hAnsi="Courier New" w:cs="Courier New" w:hint="default"/>
+      </w:rPr>
+    </w:lvl>
+    <w:lvl w:ilvl="8" w:tplc="04090005" w:tentative="1">
+      <w:start w:val="1"/>
+      <w:numFmt w:val="bullet"/>
+      <w:lvlText w:val=""/>
+      <w:lvlJc w:val="left"/>
+      <w:pPr>
+        <w:ind w:left="6480" w:hanging="360"/>
+      </w:pPr>
+      <w:rPr>
+        <w:rFonts w:ascii="Wingdings" w:hAnsi="Wingdings" w:hint="default"/>
+      </w:rPr>
+    </w:lvl>
+  </w:abstractNum>
+  <w:abstractNum w:abstractNumId="4" w15:restartNumberingAfterBreak="0">
     <w:nsid w:val="14734267"/>
     <w:multiLevelType w:val="hybridMultilevel"/>
     <w:tmpl w:val="3118EDD4"/>
@@ -3360,7 +4344,7 @@
       </w:rPr>
     </w:lvl>
   </w:abstractNum>
-  <w:abstractNum w:abstractNumId="4" w15:restartNumberingAfterBreak="0">
+  <w:abstractNum w:abstractNumId="5" w15:restartNumberingAfterBreak="0">
     <w:nsid w:val="1BCE5CE6"/>
     <w:multiLevelType w:val="hybridMultilevel"/>
     <w:tmpl w:val="605AC0FE"/>
@@ -3449,7 +4433,7 @@
       </w:pPr>
     </w:lvl>
   </w:abstractNum>
-  <w:abstractNum w:abstractNumId="5" w15:restartNumberingAfterBreak="0">
+  <w:abstractNum w:abstractNumId="6" w15:restartNumberingAfterBreak="0">
     <w:nsid w:val="1D63118D"/>
     <w:multiLevelType w:val="hybridMultilevel"/>
     <w:tmpl w:val="ADEEF8E6"/>
@@ -3562,7 +4546,7 @@
       </w:rPr>
     </w:lvl>
   </w:abstractNum>
-  <w:abstractNum w:abstractNumId="6" w15:restartNumberingAfterBreak="0">
+  <w:abstractNum w:abstractNumId="7" w15:restartNumberingAfterBreak="0">
     <w:nsid w:val="1EE86D0D"/>
     <w:multiLevelType w:val="hybridMultilevel"/>
     <w:tmpl w:val="90A0D16C"/>
@@ -3675,7 +4659,7 @@
       </w:rPr>
     </w:lvl>
   </w:abstractNum>
-  <w:abstractNum w:abstractNumId="7" w15:restartNumberingAfterBreak="0">
+  <w:abstractNum w:abstractNumId="8" w15:restartNumberingAfterBreak="0">
     <w:nsid w:val="25864ED9"/>
     <w:multiLevelType w:val="hybridMultilevel"/>
     <w:tmpl w:val="5EFC663E"/>
@@ -3788,7 +4772,7 @@
       </w:rPr>
     </w:lvl>
   </w:abstractNum>
-  <w:abstractNum w:abstractNumId="8" w15:restartNumberingAfterBreak="0">
+  <w:abstractNum w:abstractNumId="9" w15:restartNumberingAfterBreak="0">
     <w:nsid w:val="2BB15E22"/>
     <w:multiLevelType w:val="hybridMultilevel"/>
     <w:tmpl w:val="FB466858"/>
@@ -3901,7 +4885,7 @@
       </w:rPr>
     </w:lvl>
   </w:abstractNum>
-  <w:abstractNum w:abstractNumId="9" w15:restartNumberingAfterBreak="0">
+  <w:abstractNum w:abstractNumId="10" w15:restartNumberingAfterBreak="0">
     <w:nsid w:val="2E620F3C"/>
     <w:multiLevelType w:val="hybridMultilevel"/>
     <w:tmpl w:val="1A266DD2"/>
@@ -3991,7 +4975,7 @@
       </w:pPr>
     </w:lvl>
   </w:abstractNum>
-  <w:abstractNum w:abstractNumId="10" w15:restartNumberingAfterBreak="0">
+  <w:abstractNum w:abstractNumId="11" w15:restartNumberingAfterBreak="0">
     <w:nsid w:val="3E6A333A"/>
     <w:multiLevelType w:val="hybridMultilevel"/>
     <w:tmpl w:val="F24865C0"/>
@@ -4080,7 +5064,7 @@
       </w:pPr>
     </w:lvl>
   </w:abstractNum>
-  <w:abstractNum w:abstractNumId="11" w15:restartNumberingAfterBreak="0">
+  <w:abstractNum w:abstractNumId="12" w15:restartNumberingAfterBreak="0">
     <w:nsid w:val="48DA1A97"/>
     <w:multiLevelType w:val="hybridMultilevel"/>
     <w:tmpl w:val="76C4B704"/>
@@ -4193,7 +5177,7 @@
       </w:rPr>
     </w:lvl>
   </w:abstractNum>
-  <w:abstractNum w:abstractNumId="12" w15:restartNumberingAfterBreak="0">
+  <w:abstractNum w:abstractNumId="13" w15:restartNumberingAfterBreak="0">
     <w:nsid w:val="757C610E"/>
     <w:multiLevelType w:val="hybridMultilevel"/>
     <w:tmpl w:val="385A31B0"/>
@@ -4306,7 +5290,7 @@
       </w:rPr>
     </w:lvl>
   </w:abstractNum>
-  <w:abstractNum w:abstractNumId="13" w15:restartNumberingAfterBreak="0">
+  <w:abstractNum w:abstractNumId="14" w15:restartNumberingAfterBreak="0">
     <w:nsid w:val="7A47414D"/>
     <w:multiLevelType w:val="hybridMultilevel"/>
     <w:tmpl w:val="F0940316"/>
@@ -4393,55 +5377,58 @@
     </w:lvl>
   </w:abstractNum>
   <w:num w:numId="1" w16cid:durableId="1554660308">
-    <w:abstractNumId w:val="9"/>
+    <w:abstractNumId w:val="10"/>
   </w:num>
   <w:num w:numId="2" w16cid:durableId="2054498468">
-    <w:abstractNumId w:val="9"/>
+    <w:abstractNumId w:val="10"/>
   </w:num>
   <w:num w:numId="3" w16cid:durableId="1445612529">
     <w:abstractNumId w:val="0"/>
   </w:num>
   <w:num w:numId="4" w16cid:durableId="1193415824">
-    <w:abstractNumId w:val="9"/>
+    <w:abstractNumId w:val="10"/>
   </w:num>
   <w:num w:numId="5" w16cid:durableId="1350328102">
     <w:abstractNumId w:val="0"/>
   </w:num>
   <w:num w:numId="6" w16cid:durableId="1929385078">
+    <w:abstractNumId w:val="5"/>
+  </w:num>
+  <w:num w:numId="7" w16cid:durableId="104009264">
+    <w:abstractNumId w:val="11"/>
+  </w:num>
+  <w:num w:numId="8" w16cid:durableId="1251505745">
+    <w:abstractNumId w:val="6"/>
+  </w:num>
+  <w:num w:numId="9" w16cid:durableId="1951037693">
     <w:abstractNumId w:val="4"/>
   </w:num>
-  <w:num w:numId="7" w16cid:durableId="104009264">
-    <w:abstractNumId w:val="10"/>
-  </w:num>
-  <w:num w:numId="8" w16cid:durableId="1251505745">
-    <w:abstractNumId w:val="5"/>
-  </w:num>
-  <w:num w:numId="9" w16cid:durableId="1951037693">
-    <w:abstractNumId w:val="3"/>
-  </w:num>
   <w:num w:numId="10" w16cid:durableId="1563177503">
-    <w:abstractNumId w:val="13"/>
+    <w:abstractNumId w:val="14"/>
   </w:num>
   <w:num w:numId="11" w16cid:durableId="1756635187">
     <w:abstractNumId w:val="2"/>
   </w:num>
   <w:num w:numId="12" w16cid:durableId="1184200262">
-    <w:abstractNumId w:val="7"/>
+    <w:abstractNumId w:val="8"/>
   </w:num>
   <w:num w:numId="13" w16cid:durableId="1473449042">
-    <w:abstractNumId w:val="11"/>
+    <w:abstractNumId w:val="12"/>
   </w:num>
   <w:num w:numId="14" w16cid:durableId="590237487">
     <w:abstractNumId w:val="1"/>
   </w:num>
   <w:num w:numId="15" w16cid:durableId="1145197621">
-    <w:abstractNumId w:val="8"/>
+    <w:abstractNumId w:val="9"/>
   </w:num>
   <w:num w:numId="16" w16cid:durableId="261383635">
-    <w:abstractNumId w:val="6"/>
+    <w:abstractNumId w:val="7"/>
   </w:num>
   <w:num w:numId="17" w16cid:durableId="647436779">
-    <w:abstractNumId w:val="12"/>
+    <w:abstractNumId w:val="13"/>
+  </w:num>
+  <w:num w:numId="18" w16cid:durableId="1965696876">
+    <w:abstractNumId w:val="3"/>
   </w:num>
 </w:numbering>
 </file>
@@ -5048,6 +6035,7 @@
   <w:style w:type="character" w:default="1" w:styleId="DefaultParagraphFont">
     <w:name w:val="Default Paragraph Font"/>
     <w:uiPriority w:val="1"/>
+    <w:semiHidden/>
     <w:unhideWhenUsed/>
   </w:style>
   <w:style w:type="table" w:default="1" w:styleId="TableNormal">

</xml_diff>

<commit_message>
Analyze more about stakeholders'interests
</commit_message>
<xml_diff>
--- a/IELTSFLOW/Stakeholder_Analysis.docx
+++ b/IELTSFLOW/Stakeholder_Analysis.docx
@@ -21,7 +21,7 @@
           <w:sz w:val="48"/>
           <w:szCs w:val="48"/>
         </w:rPr>
-        <w:t>XÁC ĐỊNH STAKEHOLDER</w:t>
+        <w:t>XÁC ĐỊNH</w:t>
       </w:r>
       <w:r>
         <w:rPr>
@@ -31,7 +31,7 @@
           <w:sz w:val="48"/>
           <w:szCs w:val="48"/>
         </w:rPr>
-        <w:t>S</w:t>
+        <w:t xml:space="preserve"> VÀ PHÂN TÍCH</w:t>
       </w:r>
       <w:r>
         <w:rPr>
@@ -41,6 +41,26 @@
           <w:sz w:val="48"/>
           <w:szCs w:val="48"/>
         </w:rPr>
+        <w:t xml:space="preserve"> STAKEHOLDER</w:t>
+      </w:r>
+      <w:r>
+        <w:rPr>
+          <w:b/>
+          <w:bCs/>
+          <w:color w:val="0070C0"/>
+          <w:sz w:val="48"/>
+          <w:szCs w:val="48"/>
+        </w:rPr>
+        <w:t>S</w:t>
+      </w:r>
+      <w:r>
+        <w:rPr>
+          <w:b/>
+          <w:bCs/>
+          <w:color w:val="0070C0"/>
+          <w:sz w:val="48"/>
+          <w:szCs w:val="48"/>
+        </w:rPr>
         <w:t xml:space="preserve"> CỦA DỰ ÁN IELTSFLOW</w:t>
       </w:r>
     </w:p>
@@ -48,9 +68,37 @@
       <w:pPr>
         <w:pStyle w:val="TieuDe1"/>
       </w:pPr>
-      <w:proofErr w:type="spellStart"/>
-      <w:r>
-        <w:t>Khái</w:t>
+      <w:r>
+        <w:t>S</w:t>
+      </w:r>
+      <w:r>
+        <w:t>takeholders</w:t>
+      </w:r>
+      <w:r>
+        <w:t xml:space="preserve"> </w:t>
+      </w:r>
+      <w:proofErr w:type="spellStart"/>
+      <w:r>
+        <w:t>và</w:t>
+      </w:r>
+      <w:proofErr w:type="spellEnd"/>
+      <w:r>
+        <w:t xml:space="preserve"> </w:t>
+      </w:r>
+      <w:proofErr w:type="spellStart"/>
+      <w:r>
+        <w:t>các</w:t>
+      </w:r>
+      <w:proofErr w:type="spellEnd"/>
+      <w:r>
+        <w:t xml:space="preserve"> </w:t>
+      </w:r>
+      <w:proofErr w:type="spellStart"/>
+      <w:r>
+        <w:t>k</w:t>
+      </w:r>
+      <w:r>
+        <w:t>hái</w:t>
       </w:r>
       <w:proofErr w:type="spellEnd"/>
       <w:r>
@@ -62,7 +110,23 @@
       </w:r>
       <w:proofErr w:type="spellEnd"/>
       <w:r>
-        <w:t xml:space="preserve"> stakeholders: </w:t>
+        <w:t xml:space="preserve"> </w:t>
+      </w:r>
+      <w:proofErr w:type="spellStart"/>
+      <w:r>
+        <w:t>liên</w:t>
+      </w:r>
+      <w:proofErr w:type="spellEnd"/>
+      <w:r>
+        <w:t xml:space="preserve"> </w:t>
+      </w:r>
+      <w:proofErr w:type="spellStart"/>
+      <w:r>
+        <w:t>quan</w:t>
+      </w:r>
+      <w:proofErr w:type="spellEnd"/>
+      <w:r>
+        <w:t xml:space="preserve">: </w:t>
       </w:r>
     </w:p>
     <w:p>
@@ -427,7 +491,13 @@
         <w:t> (Business Analysis Body of Knowledge</w:t>
       </w:r>
       <w:r>
-        <w:t xml:space="preserve">) </w:t>
+        <w:t>)</w:t>
+      </w:r>
+      <w:r>
+        <w:t>,</w:t>
+      </w:r>
+      <w:r>
+        <w:t xml:space="preserve"> </w:t>
       </w:r>
       <w:proofErr w:type="spellStart"/>
       <w:r>
@@ -2569,10 +2639,7 @@
         </w:numPr>
       </w:pPr>
       <w:r>
-        <w:t>Gain</w:t>
-      </w:r>
-      <w:r>
-        <w:t xml:space="preserve">: </w:t>
+        <w:t xml:space="preserve">Gain: </w:t>
       </w:r>
       <w:proofErr w:type="spellStart"/>
       <w:r>
@@ -2685,10 +2752,7 @@
         </w:numPr>
       </w:pPr>
       <w:r>
-        <w:t>Fear</w:t>
-      </w:r>
-      <w:r>
-        <w:t xml:space="preserve">: </w:t>
+        <w:t xml:space="preserve">Fear: </w:t>
       </w:r>
       <w:proofErr w:type="spellStart"/>
       <w:r>
@@ -2727,6 +2791,7 @@
         <w:rPr>
           <w:b/>
           <w:bCs/>
+          <w:color w:val="EE0000"/>
           <w:u w:val="single"/>
         </w:rPr>
         <w:t>quan</w:t>
@@ -2736,6 +2801,7 @@
         <w:rPr>
           <w:b/>
           <w:bCs/>
+          <w:color w:val="EE0000"/>
           <w:u w:val="single"/>
         </w:rPr>
         <w:t xml:space="preserve"> </w:t>
@@ -2745,12 +2811,16 @@
         <w:rPr>
           <w:b/>
           <w:bCs/>
+          <w:color w:val="EE0000"/>
           <w:u w:val="single"/>
         </w:rPr>
         <w:t>ngại</w:t>
       </w:r>
       <w:proofErr w:type="spellEnd"/>
       <w:r>
+        <w:rPr>
+          <w:color w:val="EE0000"/>
+        </w:rPr>
         <w:t xml:space="preserve"> </w:t>
       </w:r>
       <w:proofErr w:type="spellStart"/>
@@ -8255,6 +8325,7 @@
   <w:style w:type="character" w:default="1" w:styleId="DefaultParagraphFont">
     <w:name w:val="Default Paragraph Font"/>
     <w:uiPriority w:val="1"/>
+    <w:semiHidden/>
     <w:unhideWhenUsed/>
   </w:style>
   <w:style w:type="table" w:default="1" w:styleId="TableNormal">

</xml_diff>